<commit_message>
Added Footer and Header pages
Co-Authored-By: Angelo Primero <158488057+APrimero12@users.noreply.github.com>
Co-Authored-By: Mohamed Amine <143552006+MohAmine2006@users.noreply.github.com>
</commit_message>
<xml_diff>
--- a/Deliverables/D1_TheWilsons_Mix&Max.docx
+++ b/Deliverables/D1_TheWilsons_Mix&Max.docx
@@ -1,1714 +1,3 @@
-
-<file path=word/document.xml><?xml version="1.0" encoding="utf-8"?>
-<w:document xmlns:wpc="http://schemas.microsoft.com/office/word/2010/wordprocessingCanvas" xmlns:cx="http://schemas.microsoft.com/office/drawing/2014/chartex" xmlns:cx1="http://schemas.microsoft.com/office/drawing/2015/9/8/chartex" xmlns:cx2="http://schemas.microsoft.com/office/drawing/2015/10/21/chartex" xmlns:cx3="http://schemas.microsoft.com/office/drawing/2016/5/9/chartex" xmlns:cx4="http://schemas.microsoft.com/office/drawing/2016/5/10/chartex" xmlns:cx5="http://schemas.microsoft.com/office/drawing/2016/5/11/chartex" xmlns:cx6="http://schemas.microsoft.com/office/drawing/2016/5/12/chartex" xmlns:cx7="http://schemas.microsoft.com/office/drawing/2016/5/13/chartex" xmlns:cx8="http://schemas.microsoft.com/office/drawing/2016/5/14/chartex" xmlns:mc="http://schemas.openxmlformats.org/markup-compatibility/2006" xmlns:aink="http://schemas.microsoft.com/office/drawing/2016/ink" xmlns:am3d="http://schemas.microsoft.com/office/drawing/2017/model3d" xmlns:o="urn:schemas-microsoft-com:office:office" xmlns:oel="http://schemas.microsoft.com/office/2019/extlst" xmlns:r="http://schemas.openxmlformats.org/officeDocument/2006/relationships" xmlns:m="http://schemas.openxmlformats.org/officeDocument/2006/math" xmlns:v="urn:schemas-microsoft-com:vml" xmlns:wp14="http://schemas.microsoft.com/office/word/2010/wordprocessingDrawing" xmlns:wp="http://schemas.openxmlformats.org/drawingml/2006/wordprocessingDrawing" xmlns:w10="urn:schemas-microsoft-com:office:word" xmlns:w="http://schemas.openxmlformats.org/wordprocessingml/2006/main" xmlns:w14="http://schemas.microsoft.com/office/word/2010/wordml" xmlns:w15="http://schemas.microsoft.com/office/word/2012/wordml" xmlns:w16cex="http://schemas.microsoft.com/office/word/2018/wordml/cex" xmlns:w16cid="http://schemas.microsoft.com/office/word/2016/wordml/cid" xmlns:w16="http://schemas.microsoft.com/office/word/2018/wordml" xmlns:w16du="http://schemas.microsoft.com/office/word/2023/wordml/word16du" xmlns:w16sdtdh="http://schemas.microsoft.com/office/word/2020/wordml/sdtdatahash" xmlns:w16sdtfl="http://schemas.microsoft.com/office/word/2024/wordml/sdtformatlock" xmlns:w16se="http://schemas.microsoft.com/office/word/2015/wordml/symex" xmlns:wpg="http://schemas.microsoft.com/office/word/2010/wordprocessingGroup" xmlns:wpi="http://schemas.microsoft.com/office/word/2010/wordprocessingInk" xmlns:wne="http://schemas.microsoft.com/office/word/2006/wordml" xmlns:wps="http://schemas.microsoft.com/office/word/2010/wordprocessingShape" mc:Ignorable="w14 w15 w16se w16cid w16 w16cex w16sdtdh w16sdtfl w16du wp14">
-  <w:body>
-    <w:p>
-      <w:pPr>
-        <w:pStyle w:val="Title"/>
-        <w:jc w:val="center"/>
-      </w:pPr>
-      <w:r>
-        <w:rPr>
-          <w:noProof/>
-        </w:rPr>
-        <w:drawing>
-          <wp:inline distT="0" distB="0" distL="0" distR="0" wp14:anchorId="43A1D412" wp14:editId="00779270">
-            <wp:extent cx="3347499" cy="991732"/>
-            <wp:effectExtent l="0" t="0" r="5715" b="0"/>
-            <wp:docPr id="2017900522" name="Picture 1">
-              <a:extLst xmlns:a="http://schemas.openxmlformats.org/drawingml/2006/main">
-                <a:ext uri="{FF2B5EF4-FFF2-40B4-BE49-F238E27FC236}">
-                  <a16:creationId xmlns:a16="http://schemas.microsoft.com/office/drawing/2014/main" id="{B7C075DF-9B30-45B4-B1F6-BCB848A66F43}"/>
-                </a:ext>
-              </a:extLst>
-            </wp:docPr>
-            <wp:cNvGraphicFramePr>
-              <a:graphicFrameLocks xmlns:a="http://schemas.openxmlformats.org/drawingml/2006/main" noChangeAspect="1"/>
-            </wp:cNvGraphicFramePr>
-            <a:graphic xmlns:a="http://schemas.openxmlformats.org/drawingml/2006/main">
-              <a:graphicData uri="http://schemas.openxmlformats.org/drawingml/2006/picture">
-                <pic:pic xmlns:pic="http://schemas.openxmlformats.org/drawingml/2006/picture">
-                  <pic:nvPicPr>
-                    <pic:cNvPr id="0" name="Picture 1"/>
-                    <pic:cNvPicPr>
-                      <a:picLocks noChangeAspect="1" noChangeArrowheads="1"/>
-                    </pic:cNvPicPr>
-                  </pic:nvPicPr>
-                  <pic:blipFill>
-                    <a:blip r:embed="rId5" cstate="print">
-                      <a:extLst>
-                        <a:ext uri="{28A0092B-C50C-407E-A947-70E740481C1C}">
-                          <a14:useLocalDpi xmlns:a14="http://schemas.microsoft.com/office/drawing/2010/main" val="0"/>
-                        </a:ext>
-                      </a:extLst>
-                    </a:blip>
-                    <a:srcRect/>
-                    <a:stretch>
-                      <a:fillRect/>
-                    </a:stretch>
-                  </pic:blipFill>
-                  <pic:spPr bwMode="auto">
-                    <a:xfrm>
-                      <a:off x="0" y="0"/>
-                      <a:ext cx="3387028" cy="1003443"/>
-                    </a:xfrm>
-                    <a:prstGeom prst="rect">
-                      <a:avLst/>
-                    </a:prstGeom>
-                    <a:noFill/>
-                    <a:ln>
-                      <a:noFill/>
-                    </a:ln>
-                  </pic:spPr>
-                </pic:pic>
-              </a:graphicData>
-            </a:graphic>
-          </wp:inline>
-        </w:drawing>
-      </w:r>
-    </w:p>
-    <w:p>
-      <w:pPr>
-        <w:jc w:val="center"/>
-        <w:rPr>
-          <w:b/>
-          <w:bCs/>
-        </w:rPr>
-      </w:pPr>
-      <w:r>
-        <w:rPr>
-          <w:b/>
-          <w:bCs/>
-        </w:rPr>
-        <w:t>Faculty of Science and Technology</w:t>
-      </w:r>
-      <w:r>
-        <w:rPr>
-          <w:b/>
-          <w:bCs/>
-        </w:rPr>
-        <w:br/>
-        <w:t>420-411-VA E-Commerce Section 00001</w:t>
-      </w:r>
-    </w:p>
-    <w:p>
-      <w:pPr>
-        <w:jc w:val="center"/>
-        <w:rPr>
-          <w:b/>
-          <w:bCs/>
-        </w:rPr>
-      </w:pPr>
-    </w:p>
-    <w:p>
-      <w:pPr>
-        <w:pStyle w:val="Title"/>
-        <w:jc w:val="center"/>
-        <w:rPr>
-          <w:b/>
-          <w:bCs/>
-        </w:rPr>
-      </w:pPr>
-      <w:r>
-        <w:rPr>
-          <w:b/>
-          <w:bCs/>
-        </w:rPr>
-        <w:t>Project Proposal</w:t>
-      </w:r>
-    </w:p>
-    <w:p>
-      <w:pPr>
-        <w:jc w:val="center"/>
-        <w:rPr>
-          <w:b/>
-          <w:bCs/>
-        </w:rPr>
-      </w:pPr>
-    </w:p>
-    <w:p>
-      <w:pPr>
-        <w:jc w:val="center"/>
-      </w:pPr>
-      <w:r>
-        <w:rPr>
-          <w:b/>
-          <w:bCs/>
-        </w:rPr>
-        <w:t>Team Leader</w:t>
-      </w:r>
-      <w:r>
-        <w:rPr>
-          <w:b/>
-          <w:bCs/>
-        </w:rPr>
-        <w:br/>
-      </w:r>
-      <w:r>
-        <w:t>Willkerdy Elveus (6236388)</w:t>
-      </w:r>
-    </w:p>
-    <w:p>
-      <w:pPr>
-        <w:jc w:val="center"/>
-        <w:rPr>
-          <w:b/>
-          <w:bCs/>
-        </w:rPr>
-      </w:pPr>
-      <w:r>
-        <w:rPr>
-          <w:b/>
-          <w:bCs/>
-        </w:rPr>
-        <w:t xml:space="preserve"> </w:t>
-      </w:r>
-    </w:p>
-    <w:p>
-      <w:pPr>
-        <w:jc w:val="center"/>
-      </w:pPr>
-      <w:r>
-        <w:rPr>
-          <w:b/>
-          <w:bCs/>
-        </w:rPr>
-        <w:t>Team Members</w:t>
-      </w:r>
-      <w:r>
-        <w:t xml:space="preserve"> </w:t>
-      </w:r>
-      <w:r>
-        <w:br/>
-      </w:r>
-      <w:r>
-        <w:t xml:space="preserve">Mohamed Amine </w:t>
-      </w:r>
-      <w:proofErr w:type="spellStart"/>
-      <w:r>
-        <w:t>Hamidouch</w:t>
-      </w:r>
-      <w:proofErr w:type="spellEnd"/>
-      <w:r>
-        <w:t xml:space="preserve"> (2379855)</w:t>
-      </w:r>
-      <w:r>
-        <w:br/>
-      </w:r>
-      <w:r>
-        <w:t>Luis</w:t>
-      </w:r>
-      <w:r>
-        <w:t xml:space="preserve"> Angelo Primero</w:t>
-      </w:r>
-      <w:r>
-        <w:t xml:space="preserve"> (</w:t>
-      </w:r>
-      <w:r>
-        <w:t>2272888</w:t>
-      </w:r>
-      <w:r>
-        <w:t>)</w:t>
-      </w:r>
-      <w:r>
-        <w:br/>
-      </w:r>
-      <w:r>
-        <w:t>Samuel Wilson</w:t>
-      </w:r>
-      <w:r>
-        <w:t xml:space="preserve"> (2216511)</w:t>
-      </w:r>
-    </w:p>
-    <w:p>
-      <w:pPr>
-        <w:jc w:val="center"/>
-      </w:pPr>
-    </w:p>
-    <w:p>
-      <w:pPr>
-        <w:jc w:val="center"/>
-      </w:pPr>
-      <w:r>
-        <w:rPr>
-          <w:b/>
-          <w:bCs/>
-        </w:rPr>
-        <w:t>Repository URL</w:t>
-      </w:r>
-    </w:p>
-    <w:p>
-      <w:pPr>
-        <w:jc w:val="center"/>
-      </w:pPr>
-      <w:hyperlink r:id="rId6" w:history="1">
-        <w:r>
-          <w:rPr>
-            <w:rStyle w:val="Hyperlink"/>
-          </w:rPr>
-          <w:t>https://github.com/Wlszn/Mix-Max.git</w:t>
-        </w:r>
-      </w:hyperlink>
-    </w:p>
-    <w:p>
-      <w:pPr>
-        <w:pStyle w:val="Title"/>
-        <w:jc w:val="center"/>
-        <w:rPr>
-          <w:lang w:val="fr-CA"/>
-        </w:rPr>
-      </w:pPr>
-      <w:r>
-        <w:br w:type="page"/>
-      </w:r>
-      <w:r>
-        <w:rPr>
-          <w:lang w:val="fr-CA"/>
-        </w:rPr>
-        <w:lastRenderedPageBreak/>
-        <w:t>Mix &amp; Max</w:t>
-      </w:r>
-    </w:p>
-    <w:p>
-      <w:pPr>
-        <w:pStyle w:val="Heading2"/>
-        <w:rPr>
-          <w:lang w:val="fr-CA"/>
-        </w:rPr>
-      </w:pPr>
-      <w:r>
-        <w:rPr>
-          <w:lang w:val="fr-CA"/>
-        </w:rPr>
-        <w:t>Domain Names</w:t>
-      </w:r>
-      <w:r>
-        <w:rPr>
-          <w:lang w:val="fr-CA"/>
-        </w:rPr>
-        <w:t>:</w:t>
-      </w:r>
-    </w:p>
-    <w:p>
-      <w:pPr>
-        <w:pStyle w:val="ListParagraph"/>
-        <w:numPr>
-          <w:ilvl w:val="0"/>
-          <w:numId w:val="7"/>
-        </w:numPr>
-        <w:rPr>
-          <w:lang w:val="fr-CA"/>
-        </w:rPr>
-      </w:pPr>
-      <w:r>
-        <w:t>mixandmax.com</w:t>
-      </w:r>
-    </w:p>
-    <w:p>
-      <w:pPr>
-        <w:pStyle w:val="ListParagraph"/>
-        <w:numPr>
-          <w:ilvl w:val="0"/>
-          <w:numId w:val="7"/>
-        </w:numPr>
-      </w:pPr>
-      <w:r>
-        <w:t xml:space="preserve">mixmaxevents.com </w:t>
-      </w:r>
-    </w:p>
-    <w:p>
-      <w:pPr>
-        <w:pStyle w:val="ListParagraph"/>
-        <w:numPr>
-          <w:ilvl w:val="0"/>
-          <w:numId w:val="7"/>
-        </w:numPr>
-        <w:rPr>
-          <w:lang w:val="fr-CA"/>
-        </w:rPr>
-      </w:pPr>
-      <w:r>
-        <w:t>mixmaxtickets.com</w:t>
-      </w:r>
-    </w:p>
-    <w:p>
-      <w:pPr>
-        <w:rPr>
-          <w:lang w:val="fr-CA"/>
-        </w:rPr>
-      </w:pPr>
-    </w:p>
-    <w:p>
-      <w:pPr>
-        <w:pStyle w:val="Heading2"/>
-        <w:rPr>
-          <w:lang w:val="fr-CA"/>
-        </w:rPr>
-      </w:pPr>
-      <w:r>
-        <w:rPr>
-          <w:lang w:val="fr-CA"/>
-        </w:rPr>
-        <w:t>Description:</w:t>
-      </w:r>
-    </w:p>
-    <w:p>
-      <w:r>
-        <w:t>Mix &amp; Max is a full-stack web application that allows users to discover, reserve, and purchase tickets for conc</w:t>
-      </w:r>
-      <w:r>
-        <w:t>erts and live events that they want to attend. The platform aims to simplify the ticket buying process by offering a clear event catalog</w:t>
-      </w:r>
-      <w:r>
-        <w:t>, flexible seat selection, and a secure checkout process</w:t>
-      </w:r>
-      <w:r>
-        <w:t xml:space="preserve">. </w:t>
-      </w:r>
-      <w:r>
-        <w:t xml:space="preserve">The application focuses on providing a seamless </w:t>
-      </w:r>
-      <w:r>
-        <w:t>ticket purchasing experience.</w:t>
-      </w:r>
-    </w:p>
-    <w:p>
-      <w:r>
-        <w:t xml:space="preserve">The system targets </w:t>
-      </w:r>
-      <w:r>
-        <w:t xml:space="preserve">live </w:t>
-      </w:r>
-      <w:r>
-        <w:t>eventgoers</w:t>
-      </w:r>
-      <w:r>
-        <w:t xml:space="preserve"> who want a fast and reliable way to book tickets online, as well as </w:t>
-      </w:r>
-      <w:r>
-        <w:t xml:space="preserve">administrators who manage event listings and ticket inventory. On the administrative side there is a secure </w:t>
-      </w:r>
-      <w:r>
-        <w:t>back-end</w:t>
-      </w:r>
-      <w:r>
-        <w:t xml:space="preserve"> interface that allo</w:t>
-      </w:r>
-      <w:r>
-        <w:t>ws authorized users to</w:t>
-      </w:r>
-      <w:r>
-        <w:t xml:space="preserve"> create and manage events, venues, and ticket availability using </w:t>
-      </w:r>
-      <w:r>
-        <w:t>role-based</w:t>
-      </w:r>
-      <w:r>
-        <w:t xml:space="preserve"> access and two-factor authentication</w:t>
-      </w:r>
-      <w:r>
-        <w:t xml:space="preserve"> for security.</w:t>
-      </w:r>
-    </w:p>
-    <w:p/>
-    <w:p>
-      <w:pPr>
-        <w:pStyle w:val="Heading2"/>
-        <w:rPr>
-          <w:lang w:val="fr-CA"/>
-        </w:rPr>
-      </w:pPr>
-      <w:r>
-        <w:rPr>
-          <w:lang w:val="fr-CA"/>
-        </w:rPr>
-        <w:t xml:space="preserve">Target </w:t>
-      </w:r>
-      <w:proofErr w:type="spellStart"/>
-      <w:r>
-        <w:rPr>
-          <w:lang w:val="fr-CA"/>
-        </w:rPr>
-        <w:t>Users</w:t>
-      </w:r>
-      <w:proofErr w:type="spellEnd"/>
-      <w:r>
-        <w:rPr>
-          <w:lang w:val="fr-CA"/>
-        </w:rPr>
-        <w:t>:</w:t>
-      </w:r>
-    </w:p>
-    <w:p>
-      <w:pPr>
-        <w:pStyle w:val="ListParagraph"/>
-        <w:numPr>
-          <w:ilvl w:val="0"/>
-          <w:numId w:val="9"/>
-        </w:numPr>
-        <w:rPr>
-          <w:lang w:val="fr-CA"/>
-        </w:rPr>
-      </w:pPr>
-      <w:r>
-        <w:rPr>
-          <w:lang w:val="fr-CA"/>
-        </w:rPr>
-        <w:t xml:space="preserve">General </w:t>
-      </w:r>
-      <w:proofErr w:type="spellStart"/>
-      <w:r>
-        <w:rPr>
-          <w:lang w:val="fr-CA"/>
-        </w:rPr>
-        <w:t>Users</w:t>
-      </w:r>
-      <w:proofErr w:type="spellEnd"/>
-    </w:p>
-    <w:p>
-      <w:pPr>
-        <w:pStyle w:val="ListParagraph"/>
-        <w:numPr>
-          <w:ilvl w:val="1"/>
-          <w:numId w:val="9"/>
-        </w:numPr>
-      </w:pPr>
-      <w:r>
-        <w:t>People looking to discover a</w:t>
-      </w:r>
-      <w:r>
-        <w:t xml:space="preserve">nd purchase tickets for </w:t>
-      </w:r>
-      <w:r>
-        <w:t>concerts</w:t>
-      </w:r>
-      <w:r>
-        <w:t xml:space="preserve"> and events</w:t>
-      </w:r>
-    </w:p>
-    <w:p>
-      <w:pPr>
-        <w:pStyle w:val="ListParagraph"/>
-        <w:numPr>
-          <w:ilvl w:val="0"/>
-          <w:numId w:val="9"/>
-        </w:numPr>
-      </w:pPr>
-      <w:r>
-        <w:t>Administrators</w:t>
-      </w:r>
-    </w:p>
-    <w:p>
-      <w:pPr>
-        <w:pStyle w:val="ListParagraph"/>
-        <w:numPr>
-          <w:ilvl w:val="1"/>
-          <w:numId w:val="9"/>
-        </w:numPr>
-      </w:pPr>
-      <w:r>
-        <w:t>Event organizers or staff managing events and ticket inventory</w:t>
-      </w:r>
-    </w:p>
-    <w:p>
-      <w:pPr>
-        <w:pStyle w:val="Heading2"/>
-      </w:pPr>
-    </w:p>
-    <w:p>
-      <w:pPr>
-        <w:pStyle w:val="Heading2"/>
-      </w:pPr>
-      <w:r>
-        <w:t xml:space="preserve">Repository </w:t>
-      </w:r>
-      <w:r>
-        <w:t>URL</w:t>
-      </w:r>
-    </w:p>
-    <w:p>
-      <w:r>
-        <w:t xml:space="preserve"> </w:t>
-      </w:r>
-      <w:hyperlink r:id="rId7" w:history="1">
-        <w:r>
-          <w:rPr>
-            <w:rStyle w:val="Hyperlink"/>
-          </w:rPr>
-          <w:t>https://github.com/Wlszn/Mix-Max.git</w:t>
-        </w:r>
-      </w:hyperlink>
-    </w:p>
-    <w:p>
-      <w:r>
-        <w:br w:type="page"/>
-      </w:r>
-    </w:p>
-    <w:p>
-      <w:pPr>
-        <w:pStyle w:val="Heading2"/>
-      </w:pPr>
-      <w:r>
-        <w:lastRenderedPageBreak/>
-        <w:t xml:space="preserve">Feature Suite </w:t>
-      </w:r>
-    </w:p>
-    <w:p>
-      <w:pPr>
-        <w:pStyle w:val="Heading3"/>
-      </w:pPr>
-      <w:r>
-        <w:t xml:space="preserve">Event search </w:t>
-      </w:r>
-      <w:r>
-        <w:t>&amp; AJAX</w:t>
-      </w:r>
-      <w:r>
-        <w:t xml:space="preserve"> filtering</w:t>
-      </w:r>
-    </w:p>
-    <w:p>
-      <w:r>
-        <w:t>Users can search</w:t>
-      </w:r>
-      <w:r>
-        <w:t xml:space="preserve"> for events by artist, venue, city, date range, or genre. Results update dynamically</w:t>
-      </w:r>
-      <w:r>
-        <w:t xml:space="preserve"> using AJAX filters like price range, availability, date</w:t>
-      </w:r>
-      <w:r>
-        <w:t xml:space="preserve">. </w:t>
-      </w:r>
-    </w:p>
-    <w:p>
-      <w:pPr>
-        <w:pStyle w:val="Heading3"/>
-      </w:pPr>
-      <w:r>
-        <w:t>List-based</w:t>
-      </w:r>
-      <w:r>
-        <w:t xml:space="preserve"> seat selection</w:t>
-      </w:r>
-    </w:p>
-    <w:p>
-      <w:r>
-        <w:t>For a chosen event, available seats are displayed in a list grouped by</w:t>
-      </w:r>
-      <w:r>
-        <w:t xml:space="preserve"> row. The users will be able to select</w:t>
-      </w:r>
-      <w:r>
-        <w:t xml:space="preserve"> specific seats</w:t>
-      </w:r>
-      <w:r>
-        <w:t xml:space="preserve"> </w:t>
-      </w:r>
-      <w:r>
-        <w:t xml:space="preserve">in each row. They can even buy multiple seats if those seats are available. </w:t>
-      </w:r>
-      <w:r>
-        <w:t xml:space="preserve">The system prevents double-booking by checking availability </w:t>
-      </w:r>
-      <w:r>
-        <w:t>in real time.</w:t>
-      </w:r>
-    </w:p>
-    <w:p>
-      <w:pPr>
-        <w:pStyle w:val="Heading3"/>
-      </w:pPr>
-      <w:r>
-        <w:t>Session based cart</w:t>
-      </w:r>
-    </w:p>
-    <w:p>
-      <w:r>
-        <w:t xml:space="preserve">Selected seats are stored in a </w:t>
-      </w:r>
-      <w:r>
-        <w:t>session-based</w:t>
-      </w:r>
-      <w:r>
-        <w:t xml:space="preserve"> cart. Users can add tickets for multiple events</w:t>
-      </w:r>
-      <w:r>
-        <w:t>, adjust quantities, and remove selections before proceeding to check out. They’ll be able to log out and log in back and it will still be in their cart.</w:t>
-      </w:r>
-    </w:p>
-    <w:p>
-      <w:pPr>
-        <w:pStyle w:val="Heading3"/>
-      </w:pPr>
-      <w:r>
-        <w:t>Booking confirmation</w:t>
-      </w:r>
-    </w:p>
-    <w:p>
-      <w:r>
-        <w:t xml:space="preserve">After checkout the system creates a unique booking reference </w:t>
-      </w:r>
-      <w:r>
-        <w:t>and generates a PDF e-ticket containing event details, and seat numbers for entry</w:t>
-      </w:r>
-      <w:r>
-        <w:t xml:space="preserve">. A confirmation page and email will also </w:t>
-      </w:r>
-      <w:r>
-        <w:t>be displayed</w:t>
-      </w:r>
-      <w:r>
-        <w:t xml:space="preserve"> after paying.</w:t>
-      </w:r>
-    </w:p>
-    <w:p>
-      <w:pPr>
-        <w:pStyle w:val="Heading3"/>
-      </w:pPr>
-      <w:r>
-        <w:t>Admin Dashboard</w:t>
-      </w:r>
-    </w:p>
-    <w:p>
-      <w:r>
-        <w:t>Administrators log in using two</w:t>
-      </w:r>
-      <w:r>
-        <w:t>-</w:t>
-      </w:r>
-      <w:r>
-        <w:t>factor authentication. From the dashboard they can</w:t>
-      </w:r>
-      <w:r>
-        <w:t xml:space="preserve"> perform CRUD operations on events, venues, and ticket inventory. They’ll also be able to view </w:t>
-      </w:r>
-      <w:r>
-        <w:t>reports and cancel bookings. Role based access makes sure only admins can see that page and have the priv</w:t>
-      </w:r>
-      <w:r>
-        <w:t>ileges to modify anything.</w:t>
-      </w:r>
-    </w:p>
-    <w:p>
-      <w:pPr>
-        <w:pStyle w:val="Heading3"/>
-      </w:pPr>
-      <w:r>
-        <w:t>Internationalization</w:t>
-      </w:r>
-    </w:p>
-    <w:p>
-      <w:r>
-        <w:t xml:space="preserve">The platform supports multiple languages, allowing users to switch languages dynamically and improving accessibility for a </w:t>
-      </w:r>
-      <w:r>
-        <w:t>wider</w:t>
-      </w:r>
-      <w:r>
-        <w:t xml:space="preserve"> audience.</w:t>
-      </w:r>
-    </w:p>
-    <w:p>
-      <w:r>
-        <w:br w:type="page"/>
-      </w:r>
-    </w:p>
-    <w:p>
-      <w:pPr>
-        <w:pStyle w:val="Heading2"/>
-      </w:pPr>
-      <w:r>
-        <w:lastRenderedPageBreak/>
-        <w:t>ERD Diagram</w:t>
-      </w:r>
-    </w:p>
-    <w:p>
-      <w:pPr>
-        <w:pStyle w:val="ListParagraph"/>
-        <w:numPr>
-          <w:ilvl w:val="0"/>
-          <w:numId w:val="1"/>
-        </w:numPr>
-      </w:pPr>
-      <w:r>
-        <w:t>User</w:t>
-      </w:r>
-    </w:p>
-    <w:p>
-      <w:pPr>
-        <w:pStyle w:val="ListParagraph"/>
-        <w:numPr>
-          <w:ilvl w:val="1"/>
-          <w:numId w:val="1"/>
-        </w:numPr>
-      </w:pPr>
-      <w:r>
-        <w:t>I</w:t>
-      </w:r>
-      <w:r>
-        <w:t>d</w:t>
-      </w:r>
-    </w:p>
-    <w:p>
-      <w:pPr>
-        <w:pStyle w:val="ListParagraph"/>
-        <w:numPr>
-          <w:ilvl w:val="1"/>
-          <w:numId w:val="1"/>
-        </w:numPr>
-      </w:pPr>
-      <w:r>
-        <w:t>U</w:t>
-      </w:r>
-      <w:r>
-        <w:t>sername</w:t>
-      </w:r>
-    </w:p>
-    <w:p>
-      <w:pPr>
-        <w:pStyle w:val="ListParagraph"/>
-        <w:numPr>
-          <w:ilvl w:val="1"/>
-          <w:numId w:val="1"/>
-        </w:numPr>
-      </w:pPr>
-      <w:r>
-        <w:t>E</w:t>
-      </w:r>
-      <w:r>
-        <w:t>mail</w:t>
-      </w:r>
-    </w:p>
-    <w:p>
-      <w:pPr>
-        <w:pStyle w:val="ListParagraph"/>
-        <w:numPr>
-          <w:ilvl w:val="1"/>
-          <w:numId w:val="1"/>
-        </w:numPr>
-      </w:pPr>
-      <w:proofErr w:type="spellStart"/>
-      <w:r>
-        <w:t>P</w:t>
-      </w:r>
-      <w:r>
-        <w:t>assword</w:t>
-      </w:r>
-      <w:r>
-        <w:t>_hash</w:t>
-      </w:r>
-      <w:proofErr w:type="spellEnd"/>
-    </w:p>
-    <w:p>
-      <w:pPr>
-        <w:pStyle w:val="ListParagraph"/>
-        <w:numPr>
-          <w:ilvl w:val="1"/>
-          <w:numId w:val="1"/>
-        </w:numPr>
-      </w:pPr>
-      <w:r>
-        <w:t>2fa_secret</w:t>
-      </w:r>
-    </w:p>
-    <w:p>
-      <w:pPr>
-        <w:pStyle w:val="ListParagraph"/>
-        <w:numPr>
-          <w:ilvl w:val="1"/>
-          <w:numId w:val="1"/>
-        </w:numPr>
-      </w:pPr>
-      <w:r>
-        <w:t>R</w:t>
-      </w:r>
-      <w:r>
-        <w:t>ole</w:t>
-      </w:r>
-    </w:p>
-    <w:p>
-      <w:pPr>
-        <w:pStyle w:val="ListParagraph"/>
-        <w:numPr>
-          <w:ilvl w:val="1"/>
-          <w:numId w:val="1"/>
-        </w:numPr>
-      </w:pPr>
-      <w:proofErr w:type="spellStart"/>
-      <w:r>
-        <w:t>C</w:t>
-      </w:r>
-      <w:r>
-        <w:t>reated_at</w:t>
-      </w:r>
-      <w:proofErr w:type="spellEnd"/>
-    </w:p>
-    <w:p>
-      <w:pPr>
-        <w:pStyle w:val="ListParagraph"/>
-        <w:numPr>
-          <w:ilvl w:val="0"/>
-          <w:numId w:val="1"/>
-        </w:numPr>
-      </w:pPr>
-      <w:r>
-        <w:t>Venue</w:t>
-      </w:r>
-    </w:p>
-    <w:p>
-      <w:pPr>
-        <w:pStyle w:val="ListParagraph"/>
-        <w:numPr>
-          <w:ilvl w:val="1"/>
-          <w:numId w:val="1"/>
-        </w:numPr>
-      </w:pPr>
-      <w:r>
-        <w:t>I</w:t>
-      </w:r>
-      <w:r>
-        <w:t>d</w:t>
-      </w:r>
-    </w:p>
-    <w:p>
-      <w:pPr>
-        <w:pStyle w:val="ListParagraph"/>
-        <w:numPr>
-          <w:ilvl w:val="1"/>
-          <w:numId w:val="1"/>
-        </w:numPr>
-      </w:pPr>
-      <w:r>
-        <w:t>N</w:t>
-      </w:r>
-      <w:r>
-        <w:t>ame</w:t>
-      </w:r>
-    </w:p>
-    <w:p>
-      <w:pPr>
-        <w:pStyle w:val="ListParagraph"/>
-        <w:numPr>
-          <w:ilvl w:val="1"/>
-          <w:numId w:val="1"/>
-        </w:numPr>
-      </w:pPr>
-      <w:r>
-        <w:t>A</w:t>
-      </w:r>
-      <w:r>
-        <w:t>ddress</w:t>
-      </w:r>
-    </w:p>
-    <w:p>
-      <w:pPr>
-        <w:pStyle w:val="ListParagraph"/>
-        <w:numPr>
-          <w:ilvl w:val="1"/>
-          <w:numId w:val="1"/>
-        </w:numPr>
-      </w:pPr>
-      <w:r>
-        <w:t>C</w:t>
-      </w:r>
-      <w:r>
-        <w:t>ity</w:t>
-      </w:r>
-    </w:p>
-    <w:p>
-      <w:pPr>
-        <w:pStyle w:val="ListParagraph"/>
-        <w:numPr>
-          <w:ilvl w:val="1"/>
-          <w:numId w:val="1"/>
-        </w:numPr>
-      </w:pPr>
-      <w:r>
-        <w:t>C</w:t>
-      </w:r>
-      <w:r>
-        <w:t>apacity</w:t>
-      </w:r>
-    </w:p>
-    <w:p>
-      <w:pPr>
-        <w:pStyle w:val="ListParagraph"/>
-        <w:numPr>
-          <w:ilvl w:val="0"/>
-          <w:numId w:val="2"/>
-        </w:numPr>
-      </w:pPr>
-      <w:r>
-        <w:t>Event</w:t>
-      </w:r>
-    </w:p>
-    <w:p>
-      <w:pPr>
-        <w:pStyle w:val="ListParagraph"/>
-        <w:numPr>
-          <w:ilvl w:val="1"/>
-          <w:numId w:val="2"/>
-        </w:numPr>
-      </w:pPr>
-      <w:r>
-        <w:t>I</w:t>
-      </w:r>
-      <w:r>
-        <w:t>d</w:t>
-      </w:r>
-    </w:p>
-    <w:p>
-      <w:pPr>
-        <w:pStyle w:val="ListParagraph"/>
-        <w:numPr>
-          <w:ilvl w:val="1"/>
-          <w:numId w:val="2"/>
-        </w:numPr>
-      </w:pPr>
-      <w:r>
-        <w:t>T</w:t>
-      </w:r>
-      <w:r>
-        <w:t>itle</w:t>
-      </w:r>
-    </w:p>
-    <w:p>
-      <w:pPr>
-        <w:pStyle w:val="ListParagraph"/>
-        <w:numPr>
-          <w:ilvl w:val="1"/>
-          <w:numId w:val="2"/>
-        </w:numPr>
-      </w:pPr>
-      <w:r>
-        <w:t>A</w:t>
-      </w:r>
-      <w:r>
-        <w:t>rtist</w:t>
-      </w:r>
-    </w:p>
-    <w:p>
-      <w:pPr>
-        <w:pStyle w:val="ListParagraph"/>
-        <w:numPr>
-          <w:ilvl w:val="1"/>
-          <w:numId w:val="2"/>
-        </w:numPr>
-      </w:pPr>
-      <w:r>
-        <w:t>D</w:t>
-      </w:r>
-      <w:r>
-        <w:t>escription</w:t>
-      </w:r>
-    </w:p>
-    <w:p>
-      <w:pPr>
-        <w:pStyle w:val="ListParagraph"/>
-        <w:numPr>
-          <w:ilvl w:val="1"/>
-          <w:numId w:val="2"/>
-        </w:numPr>
-      </w:pPr>
-      <w:proofErr w:type="spellStart"/>
-      <w:r>
-        <w:t>V</w:t>
-      </w:r>
-      <w:r>
-        <w:t>enue_id</w:t>
-      </w:r>
-      <w:proofErr w:type="spellEnd"/>
-    </w:p>
-    <w:p>
-      <w:pPr>
-        <w:pStyle w:val="ListParagraph"/>
-        <w:numPr>
-          <w:ilvl w:val="1"/>
-          <w:numId w:val="2"/>
-        </w:numPr>
-      </w:pPr>
-      <w:proofErr w:type="spellStart"/>
-      <w:r>
-        <w:t>E</w:t>
-      </w:r>
-      <w:r>
-        <w:t>vent_date</w:t>
-      </w:r>
-      <w:proofErr w:type="spellEnd"/>
-    </w:p>
-    <w:p>
-      <w:pPr>
-        <w:pStyle w:val="ListParagraph"/>
-        <w:numPr>
-          <w:ilvl w:val="1"/>
-          <w:numId w:val="2"/>
-        </w:numPr>
-      </w:pPr>
-      <w:proofErr w:type="spellStart"/>
-      <w:r>
-        <w:t>S</w:t>
-      </w:r>
-      <w:r>
-        <w:t>tart_time</w:t>
-      </w:r>
-      <w:proofErr w:type="spellEnd"/>
-    </w:p>
-    <w:p>
-      <w:pPr>
-        <w:pStyle w:val="ListParagraph"/>
-        <w:numPr>
-          <w:ilvl w:val="1"/>
-          <w:numId w:val="2"/>
-        </w:numPr>
-      </w:pPr>
-      <w:proofErr w:type="spellStart"/>
-      <w:r>
-        <w:t>E</w:t>
-      </w:r>
-      <w:r>
-        <w:t>nd_time</w:t>
-      </w:r>
-      <w:proofErr w:type="spellEnd"/>
-    </w:p>
-    <w:p>
-      <w:pPr>
-        <w:pStyle w:val="ListParagraph"/>
-        <w:numPr>
-          <w:ilvl w:val="1"/>
-          <w:numId w:val="2"/>
-        </w:numPr>
-      </w:pPr>
-      <w:proofErr w:type="spellStart"/>
-      <w:r>
-        <w:t>I</w:t>
-      </w:r>
-      <w:r>
-        <w:t>mage_path</w:t>
-      </w:r>
-      <w:proofErr w:type="spellEnd"/>
-    </w:p>
-    <w:p>
-      <w:pPr>
-        <w:pStyle w:val="ListParagraph"/>
-        <w:numPr>
-          <w:ilvl w:val="1"/>
-          <w:numId w:val="2"/>
-        </w:numPr>
-      </w:pPr>
-      <w:r>
-        <w:t>Status</w:t>
-      </w:r>
-    </w:p>
-    <w:p>
-      <w:pPr>
-        <w:pStyle w:val="ListParagraph"/>
-        <w:numPr>
-          <w:ilvl w:val="0"/>
-          <w:numId w:val="2"/>
-        </w:numPr>
-      </w:pPr>
-      <w:r>
-        <w:t>Ticket</w:t>
-      </w:r>
-    </w:p>
-    <w:p>
-      <w:pPr>
-        <w:pStyle w:val="ListParagraph"/>
-        <w:numPr>
-          <w:ilvl w:val="1"/>
-          <w:numId w:val="2"/>
-        </w:numPr>
-      </w:pPr>
-      <w:r>
-        <w:t>I</w:t>
-      </w:r>
-      <w:r>
-        <w:t>d</w:t>
-      </w:r>
-    </w:p>
-    <w:p>
-      <w:pPr>
-        <w:pStyle w:val="ListParagraph"/>
-        <w:numPr>
-          <w:ilvl w:val="1"/>
-          <w:numId w:val="2"/>
-        </w:numPr>
-      </w:pPr>
-      <w:proofErr w:type="spellStart"/>
-      <w:r>
-        <w:t>E</w:t>
-      </w:r>
-      <w:r>
-        <w:t>vent</w:t>
-      </w:r>
-      <w:r>
-        <w:t>_id</w:t>
-      </w:r>
-      <w:proofErr w:type="spellEnd"/>
-    </w:p>
-    <w:p>
-      <w:pPr>
-        <w:pStyle w:val="ListParagraph"/>
-        <w:numPr>
-          <w:ilvl w:val="1"/>
-          <w:numId w:val="2"/>
-        </w:numPr>
-      </w:pPr>
-      <w:r>
-        <w:t>S</w:t>
-      </w:r>
-      <w:r>
-        <w:t>ection</w:t>
-      </w:r>
-    </w:p>
-    <w:p>
-      <w:pPr>
-        <w:pStyle w:val="ListParagraph"/>
-        <w:numPr>
-          <w:ilvl w:val="1"/>
-          <w:numId w:val="2"/>
-        </w:numPr>
-      </w:pPr>
-      <w:proofErr w:type="spellStart"/>
-      <w:r>
-        <w:t>R</w:t>
-      </w:r>
-      <w:r>
-        <w:t>ow_number</w:t>
-      </w:r>
-      <w:proofErr w:type="spellEnd"/>
-    </w:p>
-    <w:p>
-      <w:pPr>
-        <w:pStyle w:val="ListParagraph"/>
-        <w:numPr>
-          <w:ilvl w:val="1"/>
-          <w:numId w:val="2"/>
-        </w:numPr>
-      </w:pPr>
-      <w:proofErr w:type="spellStart"/>
-      <w:r>
-        <w:t>S</w:t>
-      </w:r>
-      <w:r>
-        <w:t>eat_number</w:t>
-      </w:r>
-      <w:proofErr w:type="spellEnd"/>
-    </w:p>
-    <w:p>
-      <w:pPr>
-        <w:pStyle w:val="ListParagraph"/>
-        <w:numPr>
-          <w:ilvl w:val="1"/>
-          <w:numId w:val="2"/>
-        </w:numPr>
-      </w:pPr>
-      <w:r>
-        <w:t>P</w:t>
-      </w:r>
-      <w:r>
-        <w:t>rice</w:t>
-      </w:r>
-    </w:p>
-    <w:p>
-      <w:pPr>
-        <w:pStyle w:val="ListParagraph"/>
-        <w:numPr>
-          <w:ilvl w:val="1"/>
-          <w:numId w:val="2"/>
-        </w:numPr>
-      </w:pPr>
-      <w:r>
-        <w:t>S</w:t>
-      </w:r>
-      <w:r>
-        <w:t>tatus</w:t>
-      </w:r>
-    </w:p>
-    <w:p>
-      <w:pPr>
-        <w:pStyle w:val="ListParagraph"/>
-        <w:numPr>
-          <w:ilvl w:val="1"/>
-          <w:numId w:val="2"/>
-        </w:numPr>
-      </w:pPr>
-      <w:proofErr w:type="spellStart"/>
-      <w:r>
-        <w:t>H</w:t>
-      </w:r>
-      <w:r>
-        <w:t>eld_until</w:t>
-      </w:r>
-      <w:proofErr w:type="spellEnd"/>
-    </w:p>
-    <w:p>
-      <w:pPr>
-        <w:pStyle w:val="ListParagraph"/>
-        <w:numPr>
-          <w:ilvl w:val="1"/>
-          <w:numId w:val="2"/>
-        </w:numPr>
-      </w:pPr>
-      <w:r>
-        <w:br w:type="page"/>
-      </w:r>
-    </w:p>
-    <w:p>
-      <w:pPr>
-        <w:pStyle w:val="ListParagraph"/>
-        <w:numPr>
-          <w:ilvl w:val="0"/>
-          <w:numId w:val="3"/>
-        </w:numPr>
-      </w:pPr>
-      <w:r>
-        <w:lastRenderedPageBreak/>
-        <w:t>Booking</w:t>
-      </w:r>
-    </w:p>
-    <w:p>
-      <w:pPr>
-        <w:pStyle w:val="ListParagraph"/>
-        <w:numPr>
-          <w:ilvl w:val="1"/>
-          <w:numId w:val="3"/>
-        </w:numPr>
-      </w:pPr>
-      <w:r>
-        <w:t>I</w:t>
-      </w:r>
-      <w:r>
-        <w:t>d</w:t>
-      </w:r>
-    </w:p>
-    <w:p>
-      <w:pPr>
-        <w:pStyle w:val="ListParagraph"/>
-        <w:numPr>
-          <w:ilvl w:val="1"/>
-          <w:numId w:val="3"/>
-        </w:numPr>
-      </w:pPr>
-      <w:proofErr w:type="spellStart"/>
-      <w:r>
-        <w:t>user_id</w:t>
-      </w:r>
-      <w:proofErr w:type="spellEnd"/>
-    </w:p>
-    <w:p>
-      <w:pPr>
-        <w:pStyle w:val="ListParagraph"/>
-        <w:numPr>
-          <w:ilvl w:val="1"/>
-          <w:numId w:val="3"/>
-        </w:numPr>
-      </w:pPr>
-      <w:proofErr w:type="spellStart"/>
-      <w:r>
-        <w:t>booking_refer</w:t>
-      </w:r>
-      <w:r>
-        <w:t>en</w:t>
-      </w:r>
-      <w:r>
-        <w:t>ce</w:t>
-      </w:r>
-      <w:proofErr w:type="spellEnd"/>
-    </w:p>
-    <w:p>
-      <w:pPr>
-        <w:pStyle w:val="ListParagraph"/>
-        <w:numPr>
-          <w:ilvl w:val="1"/>
-          <w:numId w:val="3"/>
-        </w:numPr>
-      </w:pPr>
-      <w:proofErr w:type="spellStart"/>
-      <w:r>
-        <w:t>booking_date</w:t>
-      </w:r>
-      <w:proofErr w:type="spellEnd"/>
-    </w:p>
-    <w:p>
-      <w:pPr>
-        <w:pStyle w:val="ListParagraph"/>
-        <w:numPr>
-          <w:ilvl w:val="1"/>
-          <w:numId w:val="3"/>
-        </w:numPr>
-      </w:pPr>
-      <w:proofErr w:type="spellStart"/>
-      <w:r>
-        <w:t>total_price</w:t>
-      </w:r>
-      <w:proofErr w:type="spellEnd"/>
-    </w:p>
-    <w:p>
-      <w:pPr>
-        <w:pStyle w:val="ListParagraph"/>
-        <w:numPr>
-          <w:ilvl w:val="1"/>
-          <w:numId w:val="3"/>
-        </w:numPr>
-      </w:pPr>
-      <w:r>
-        <w:t>status</w:t>
-      </w:r>
-    </w:p>
-    <w:p>
-      <w:pPr>
-        <w:pStyle w:val="ListParagraph"/>
-        <w:numPr>
-          <w:ilvl w:val="0"/>
-          <w:numId w:val="3"/>
-        </w:numPr>
-      </w:pPr>
-      <w:proofErr w:type="spellStart"/>
-      <w:r>
-        <w:t>Booking_</w:t>
-      </w:r>
-      <w:r>
-        <w:t>Ticket</w:t>
-      </w:r>
-      <w:proofErr w:type="spellEnd"/>
-    </w:p>
-    <w:p>
-      <w:pPr>
-        <w:pStyle w:val="ListParagraph"/>
-        <w:numPr>
-          <w:ilvl w:val="1"/>
-          <w:numId w:val="3"/>
-        </w:numPr>
-      </w:pPr>
-      <w:r>
-        <w:t>I</w:t>
-      </w:r>
-      <w:r>
-        <w:t>d</w:t>
-      </w:r>
-    </w:p>
-    <w:p>
-      <w:pPr>
-        <w:pStyle w:val="ListParagraph"/>
-        <w:numPr>
-          <w:ilvl w:val="1"/>
-          <w:numId w:val="3"/>
-        </w:numPr>
-      </w:pPr>
-      <w:proofErr w:type="spellStart"/>
-      <w:r>
-        <w:t>B</w:t>
-      </w:r>
-      <w:r>
-        <w:t>ooking_id</w:t>
-      </w:r>
-      <w:proofErr w:type="spellEnd"/>
-    </w:p>
-    <w:p>
-      <w:pPr>
-        <w:pStyle w:val="ListParagraph"/>
-        <w:numPr>
-          <w:ilvl w:val="1"/>
-          <w:numId w:val="3"/>
-        </w:numPr>
-      </w:pPr>
-      <w:proofErr w:type="spellStart"/>
-      <w:r>
-        <w:t>T</w:t>
-      </w:r>
-      <w:r>
-        <w:t>icket_id</w:t>
-      </w:r>
-      <w:proofErr w:type="spellEnd"/>
-    </w:p>
-    <w:p>
-      <w:pPr>
-        <w:pStyle w:val="ListParagraph"/>
-        <w:numPr>
-          <w:ilvl w:val="1"/>
-          <w:numId w:val="3"/>
-        </w:numPr>
-      </w:pPr>
-      <w:proofErr w:type="spellStart"/>
-      <w:r>
-        <w:t>P</w:t>
-      </w:r>
-      <w:r>
-        <w:t>rice_paid</w:t>
-      </w:r>
-      <w:proofErr w:type="spellEnd"/>
-    </w:p>
-    <w:p>
-      <w:r>
-        <w:t>A venue can have many Events (</w:t>
-      </w:r>
-      <w:proofErr w:type="gramStart"/>
-      <w:r>
-        <w:t>1:N</w:t>
-      </w:r>
-      <w:proofErr w:type="gramEnd"/>
-      <w:r>
-        <w:t>)</w:t>
-      </w:r>
-    </w:p>
-    <w:p>
-      <w:r>
-        <w:t>An</w:t>
-      </w:r>
-      <w:r>
-        <w:t xml:space="preserve"> event belongs to one Venue and can have many tickets (</w:t>
-      </w:r>
-      <w:proofErr w:type="gramStart"/>
-      <w:r>
-        <w:t>1:N</w:t>
-      </w:r>
-      <w:proofErr w:type="gramEnd"/>
-      <w:r>
-        <w:t>)</w:t>
-      </w:r>
-    </w:p>
-    <w:p>
-      <w:r>
-        <w:t>A User can have many Bookings</w:t>
-      </w:r>
-      <w:r>
-        <w:t xml:space="preserve"> (</w:t>
-      </w:r>
-      <w:proofErr w:type="gramStart"/>
-      <w:r>
-        <w:t>1</w:t>
-      </w:r>
-      <w:r>
-        <w:t>:N</w:t>
-      </w:r>
-      <w:proofErr w:type="gramEnd"/>
-      <w:r>
-        <w:t>)</w:t>
-      </w:r>
-    </w:p>
-    <w:p>
-      <w:r>
-        <w:t xml:space="preserve">A Booking can have many Tickets, and a ticket belongs to exactly </w:t>
-      </w:r>
-      <w:r>
-        <w:t>one Booking (N: 1)</w:t>
-      </w:r>
-    </w:p>
-    <w:p>
-      <w:proofErr w:type="spellStart"/>
-      <w:r>
-        <w:t>Booking_Ticket</w:t>
-      </w:r>
-      <w:proofErr w:type="spellEnd"/>
-      <w:r>
-        <w:t xml:space="preserve"> is a many to many </w:t>
-      </w:r>
-      <w:proofErr w:type="gramStart"/>
-      <w:r>
-        <w:t>table</w:t>
-      </w:r>
-      <w:proofErr w:type="gramEnd"/>
-      <w:r>
-        <w:t xml:space="preserve"> for the booking and tickets relationship</w:t>
-      </w:r>
-    </w:p>
-    <w:p>
-      <w:r>
-        <w:rPr>
-          <w:noProof/>
-        </w:rPr>
-        <w:drawing>
-          <wp:inline distT="0" distB="0" distL="0" distR="0" wp14:anchorId="7C66BAC5" wp14:editId="76A682F1">
-            <wp:extent cx="5706094" cy="3720544"/>
-            <wp:effectExtent l="0" t="0" r="9525" b="0"/>
-            <wp:docPr id="2088170519" name="Picture 1"/>
-            <wp:cNvGraphicFramePr>
-              <a:graphicFrameLocks xmlns:a="http://schemas.openxmlformats.org/drawingml/2006/main" noChangeAspect="1"/>
-            </wp:cNvGraphicFramePr>
-            <a:graphic xmlns:a="http://schemas.openxmlformats.org/drawingml/2006/main">
-              <a:graphicData uri="http://schemas.openxmlformats.org/drawingml/2006/picture">
-                <pic:pic xmlns:pic="http://schemas.openxmlformats.org/drawingml/2006/picture">
-                  <pic:nvPicPr>
-                    <pic:cNvPr id="2088170519" name=""/>
-                    <pic:cNvPicPr/>
-                  </pic:nvPicPr>
-                  <pic:blipFill>
-                    <a:blip r:embed="rId8"/>
-                    <a:stretch>
-                      <a:fillRect/>
-                    </a:stretch>
-                  </pic:blipFill>
-                  <pic:spPr>
-                    <a:xfrm>
-                      <a:off x="0" y="0"/>
-                      <a:ext cx="5735226" cy="3739539"/>
-                    </a:xfrm>
-                    <a:prstGeom prst="rect">
-                      <a:avLst/>
-                    </a:prstGeom>
-                  </pic:spPr>
-                </pic:pic>
-              </a:graphicData>
-            </a:graphic>
-          </wp:inline>
-        </w:drawing>
-      </w:r>
-      <w:r>
-        <w:br w:type="page"/>
-      </w:r>
-    </w:p>
-    <w:p>
-      <w:pPr>
-        <w:pStyle w:val="Heading2"/>
-      </w:pPr>
-      <w:r>
-        <w:lastRenderedPageBreak/>
-        <w:t>Deployment Plan</w:t>
-      </w:r>
-    </w:p>
-    <w:p>
-      <w:r>
-        <w:rPr>
-          <w:b/>
-          <w:bCs/>
-        </w:rPr>
-        <w:t>Development</w:t>
-      </w:r>
-      <w:r>
-        <w:rPr>
-          <w:b/>
-          <w:bCs/>
-        </w:rPr>
-        <w:t>:</w:t>
-      </w:r>
-      <w:r>
-        <w:t xml:space="preserve"> </w:t>
-      </w:r>
-      <w:r>
-        <w:br/>
-      </w:r>
-      <w:r>
-        <w:t xml:space="preserve">The application will be developed and tested locally using </w:t>
-      </w:r>
-      <w:r>
-        <w:t>XAM</w:t>
-      </w:r>
-      <w:r>
-        <w:t>PP/WAMP</w:t>
-      </w:r>
-      <w:r>
-        <w:t xml:space="preserve"> </w:t>
-      </w:r>
-      <w:r>
-        <w:t xml:space="preserve">on each </w:t>
-      </w:r>
-      <w:r>
-        <w:t>member’s</w:t>
-      </w:r>
-      <w:r>
-        <w:t xml:space="preserve"> machine.</w:t>
-      </w:r>
-    </w:p>
-    <w:p>
-      <w:r>
-        <w:rPr>
-          <w:b/>
-          <w:bCs/>
-        </w:rPr>
-        <w:t>Version control</w:t>
-      </w:r>
-      <w:r>
-        <w:rPr>
-          <w:b/>
-          <w:bCs/>
-        </w:rPr>
-        <w:t>:</w:t>
-      </w:r>
-      <w:r>
-        <w:t xml:space="preserve"> </w:t>
-      </w:r>
-      <w:r>
-        <w:br/>
-      </w:r>
-      <w:r>
-        <w:t xml:space="preserve">Version control </w:t>
-      </w:r>
-      <w:r>
-        <w:t xml:space="preserve">will be managed using </w:t>
-      </w:r>
-      <w:r>
-        <w:t>GitHub</w:t>
-      </w:r>
-      <w:r>
-        <w:t>.</w:t>
-      </w:r>
-      <w:r>
-        <w:t xml:space="preserve"> Each team member will contribute through commits with clear and descriptive messages</w:t>
-      </w:r>
-    </w:p>
-    <w:p>
-      <w:r>
-        <w:rPr>
-          <w:b/>
-          <w:bCs/>
-        </w:rPr>
-        <w:t>Database:</w:t>
-      </w:r>
-      <w:r>
-        <w:t xml:space="preserve"> </w:t>
-      </w:r>
-      <w:r>
-        <w:br/>
-      </w:r>
-      <w:r>
-        <w:t xml:space="preserve">The application will use a </w:t>
-      </w:r>
-      <w:r>
-        <w:t>MariaDB</w:t>
-      </w:r>
-      <w:r>
-        <w:t xml:space="preserve"> / MySQL</w:t>
-      </w:r>
-      <w:r>
-        <w:t xml:space="preserve"> relational database for storing all application data</w:t>
-      </w:r>
-    </w:p>
-    <w:p>
-      <w:r>
-        <w:rPr>
-          <w:b/>
-          <w:bCs/>
-        </w:rPr>
-        <w:t>Hosting:</w:t>
-      </w:r>
-      <w:r>
-        <w:br/>
-      </w:r>
-      <w:r>
-        <w:t xml:space="preserve">The application will be deployed on a cloud based </w:t>
-      </w:r>
-      <w:r>
-        <w:t xml:space="preserve">private server like </w:t>
-      </w:r>
-      <w:r>
-        <w:t>Digital Ocean</w:t>
-      </w:r>
-      <w:r>
-        <w:t xml:space="preserve"> or other.</w:t>
-      </w:r>
-    </w:p>
-    <w:p/>
-    <w:sectPr>
-      <w:pgSz w:w="12240" w:h="15840"/>
-      <w:pgMar w:top="1440" w:right="1440" w:bottom="1440" w:left="1440" w:header="720" w:footer="720" w:gutter="0"/>
-      <w:cols w:space="720"/>
-      <w:docGrid w:linePitch="360"/>
-    </w:sectPr>
-  </w:body>
-</w:document>
-</file>
 
 <file path=word/numbering.xml><?xml version="1.0" encoding="utf-8"?>
 <w:numbering xmlns:wpc="http://schemas.microsoft.com/office/word/2010/wordprocessingCanvas" xmlns:cx="http://schemas.microsoft.com/office/drawing/2014/chartex" xmlns:cx1="http://schemas.microsoft.com/office/drawing/2015/9/8/chartex" xmlns:cx2="http://schemas.microsoft.com/office/drawing/2015/10/21/chartex" xmlns:cx3="http://schemas.microsoft.com/office/drawing/2016/5/9/chartex" xmlns:cx4="http://schemas.microsoft.com/office/drawing/2016/5/10/chartex" xmlns:cx5="http://schemas.microsoft.com/office/drawing/2016/5/11/chartex" xmlns:cx6="http://schemas.microsoft.com/office/drawing/2016/5/12/chartex" xmlns:cx7="http://schemas.microsoft.com/office/drawing/2016/5/13/chartex" xmlns:cx8="http://schemas.microsoft.com/office/drawing/2016/5/14/chartex" xmlns:mc="http://schemas.openxmlformats.org/markup-compatibility/2006" xmlns:aink="http://schemas.microsoft.com/office/drawing/2016/ink" xmlns:am3d="http://schemas.microsoft.com/office/drawing/2017/model3d" xmlns:o="urn:schemas-microsoft-com:office:office" xmlns:oel="http://schemas.microsoft.com/office/2019/extlst" xmlns:r="http://schemas.openxmlformats.org/officeDocument/2006/relationships" xmlns:m="http://schemas.openxmlformats.org/officeDocument/2006/math" xmlns:v="urn:schemas-microsoft-com:vml" xmlns:wp14="http://schemas.microsoft.com/office/word/2010/wordprocessingDrawing" xmlns:wp="http://schemas.openxmlformats.org/drawingml/2006/wordprocessingDrawing" xmlns:w10="urn:schemas-microsoft-com:office:word" xmlns:w="http://schemas.openxmlformats.org/wordprocessingml/2006/main" xmlns:w14="http://schemas.microsoft.com/office/word/2010/wordml" xmlns:w15="http://schemas.microsoft.com/office/word/2012/wordml" xmlns:w16cex="http://schemas.microsoft.com/office/word/2018/wordml/cex" xmlns:w16cid="http://schemas.microsoft.com/office/word/2016/wordml/cid" xmlns:w16="http://schemas.microsoft.com/office/word/2018/wordml" xmlns:w16du="http://schemas.microsoft.com/office/word/2023/wordml/word16du" xmlns:w16sdtdh="http://schemas.microsoft.com/office/word/2020/wordml/sdtdatahash" xmlns:w16sdtfl="http://schemas.microsoft.com/office/word/2024/wordml/sdtformatlock" xmlns:w16se="http://schemas.microsoft.com/office/word/2015/wordml/symex" xmlns:wpg="http://schemas.microsoft.com/office/word/2010/wordprocessingGroup" xmlns:wpi="http://schemas.microsoft.com/office/word/2010/wordprocessingInk" xmlns:wne="http://schemas.microsoft.com/office/word/2006/wordml" xmlns:wps="http://schemas.microsoft.com/office/word/2010/wordprocessingShape" mc:Ignorable="w14 w15 w16se w16cid w16 w16cex w16sdtdh w16sdtfl w16du wp14">

</xml_diff>